<commit_message>
response.docx rebuilt via html2doc letter_to_docx.py (identical typeset output)
</commit_message>
<xml_diff>
--- a/response.docx
+++ b/response.docx
@@ -892,6 +892,9 @@
     <w:p>
       <w:pPr>
         <w:spacing w:before="320" w:after="120"/>
+        <w:pBdr>
+          <w:bottom w:val="single" w:sz="6" w:space="4" w:color="14471F"/>
+        </w:pBdr>
       </w:pPr>
       <w:r>
         <w:rPr>
@@ -1031,6 +1034,9 @@
     <w:p>
       <w:pPr>
         <w:spacing w:before="320" w:after="120"/>
+        <w:pBdr>
+          <w:bottom w:val="single" w:sz="6" w:space="4" w:color="14471F"/>
+        </w:pBdr>
       </w:pPr>
       <w:r>
         <w:rPr>
@@ -1116,6 +1122,9 @@
     <w:p>
       <w:pPr>
         <w:spacing w:before="320" w:after="120"/>
+        <w:pBdr>
+          <w:bottom w:val="single" w:sz="6" w:space="4" w:color="14471F"/>
+        </w:pBdr>
       </w:pPr>
       <w:r>
         <w:rPr>
@@ -1147,6 +1156,9 @@
     <w:p>
       <w:pPr>
         <w:spacing w:before="320" w:after="120"/>
+        <w:pBdr>
+          <w:bottom w:val="single" w:sz="6" w:space="4" w:color="14471F"/>
+        </w:pBdr>
       </w:pPr>
       <w:r>
         <w:rPr>

</xml_diff>